<commit_message>
convered to PDF files
</commit_message>
<xml_diff>
--- a/uiux_jason/Prototype.docx
+++ b/uiux_jason/Prototype.docx
@@ -3,12 +3,62 @@
 <w:document xmlns:wpc="http://schemas.microsoft.com/office/word/2010/wordprocessingCanvas" xmlns:cx="http://schemas.microsoft.com/office/drawing/2014/chartex" xmlns:cx1="http://schemas.microsoft.com/office/drawing/2015/9/8/chartex" xmlns:cx2="http://schemas.microsoft.com/office/drawing/2015/10/21/chartex" xmlns:cx3="http://schemas.microsoft.com/office/drawing/2016/5/9/chartex" xmlns:cx4="http://schemas.microsoft.com/office/drawing/2016/5/10/chartex" xmlns:cx5="http://schemas.microsoft.com/office/drawing/2016/5/11/chartex" xmlns:cx6="http://schemas.microsoft.com/office/drawing/2016/5/12/chartex" xmlns:cx7="http://schemas.microsoft.com/office/drawing/2016/5/13/chartex" xmlns:cx8="http://schemas.microsoft.com/office/drawing/2016/5/14/chartex" xmlns:mc="http://schemas.openxmlformats.org/markup-compatibility/2006" xmlns:aink="http://schemas.microsoft.com/office/drawing/2016/ink" xmlns:am3d="http://schemas.microsoft.com/office/drawing/2017/model3d" xmlns:o="urn:schemas-microsoft-com:office:office" xmlns:oel="http://schemas.microsoft.com/office/2019/extlst" xmlns:r="http://schemas.openxmlformats.org/officeDocument/2006/relationships" xmlns:m="http://schemas.openxmlformats.org/officeDocument/2006/math" xmlns:v="urn:schemas-microsoft-com:vml" xmlns:wp14="http://schemas.microsoft.com/office/word/2010/wordprocessingDrawing" xmlns:wp="http://schemas.openxmlformats.org/drawingml/2006/wordprocessingDrawing" xmlns:w10="urn:schemas-microsoft-com:office:word" xmlns:w="http://schemas.openxmlformats.org/wordprocessingml/2006/main" xmlns:w14="http://schemas.microsoft.com/office/word/2010/wordml" xmlns:w15="http://schemas.microsoft.com/office/word/2012/wordml" xmlns:w16cex="http://schemas.microsoft.com/office/word/2018/wordml/cex" xmlns:w16cid="http://schemas.microsoft.com/office/word/2016/wordml/cid" xmlns:w16="http://schemas.microsoft.com/office/word/2018/wordml" xmlns:w16du="http://schemas.microsoft.com/office/word/2023/wordml/word16du" xmlns:w16sdtdh="http://schemas.microsoft.com/office/word/2020/wordml/sdtdatahash" xmlns:w16sdtfl="http://schemas.microsoft.com/office/word/2024/wordml/sdtformatlock" xmlns:w16se="http://schemas.microsoft.com/office/word/2015/wordml/symex" xmlns:wpg="http://schemas.microsoft.com/office/word/2010/wordprocessingGroup" xmlns:wpi="http://schemas.microsoft.com/office/word/2010/wordprocessingInk" xmlns:wne="http://schemas.microsoft.com/office/word/2006/wordml" xmlns:wps="http://schemas.microsoft.com/office/word/2010/wordprocessingShape" mc:Ignorable="w14 w15 w16se w16cid w16 w16cex w16sdtdh w16sdtfl w16du wp14">
   <w:body>
     <w:p>
-      <w:r>
+      <w:pPr>
+        <w:jc w:val="center"/>
+        <w:rPr>
+          <w:sz w:val="32"/>
+          <w:szCs w:val="32"/>
+        </w:rPr>
+      </w:pPr>
+      <w:r>
+        <w:rPr>
+          <w:sz w:val="32"/>
+          <w:szCs w:val="32"/>
+        </w:rPr>
+        <w:t>Mockups and Prototypes</w:t>
+      </w:r>
+    </w:p>
+    <w:p>
+      <w:pPr>
+        <w:jc w:val="center"/>
+        <w:rPr>
+          <w:sz w:val="32"/>
+          <w:szCs w:val="32"/>
+        </w:rPr>
+      </w:pPr>
+    </w:p>
+    <w:p>
+      <w:pPr>
+        <w:jc w:val="center"/>
+        <w:rPr>
+          <w:sz w:val="32"/>
+          <w:szCs w:val="32"/>
+        </w:rPr>
+      </w:pPr>
+    </w:p>
+    <w:p>
+      <w:r>
+        <w:t xml:space="preserve">Here are the mockups for the Capstone reminder app. There are four mockups below. </w:t>
+      </w:r>
+    </w:p>
+    <w:p>
+      <w:r>
+        <w:t xml:space="preserve">Here is a link to the prototype: </w:t>
+      </w:r>
+    </w:p>
+    <w:p>
+      <w:r>
+        <w:t>https://www.figma.com/design/BoKpubXVq4DIv7G1qvKopT/Proto?node-id=0-1&amp;t=5oh1eRCKpHOwdO9V-1</w:t>
+      </w:r>
+    </w:p>
+    <w:p>
+      <w:r>
+        <w:lastRenderedPageBreak/>
         <w:drawing>
-          <wp:inline distT="0" distB="0" distL="0" distR="0" wp14:anchorId="75E19FA3" wp14:editId="6BB625B3">
-            <wp:extent cx="3139712" cy="6675698"/>
-            <wp:effectExtent l="0" t="0" r="3810" b="0"/>
-            <wp:docPr id="375104987" name="Picture 1"/>
+          <wp:inline distT="0" distB="0" distL="0" distR="0" wp14:anchorId="166D1A78" wp14:editId="729D349F">
+            <wp:extent cx="3817951" cy="6896698"/>
+            <wp:effectExtent l="0" t="0" r="0" b="0"/>
+            <wp:docPr id="460773576" name="Picture 1"/>
             <wp:cNvGraphicFramePr>
               <a:graphicFrameLocks xmlns:a="http://schemas.openxmlformats.org/drawingml/2006/main" noChangeAspect="1"/>
             </wp:cNvGraphicFramePr>
@@ -16,11 +66,11 @@
               <a:graphicData uri="http://schemas.openxmlformats.org/drawingml/2006/picture">
                 <pic:pic xmlns:pic="http://schemas.openxmlformats.org/drawingml/2006/picture">
                   <pic:nvPicPr>
-                    <pic:cNvPr id="375104987" name=""/>
+                    <pic:cNvPr id="460773576" name=""/>
                     <pic:cNvPicPr/>
                   </pic:nvPicPr>
                   <pic:blipFill>
-                    <a:blip r:embed="rId4"/>
+                    <a:blip r:embed="rId6"/>
                     <a:stretch>
                       <a:fillRect/>
                     </a:stretch>
@@ -28,7 +78,7 @@
                   <pic:spPr>
                     <a:xfrm>
                       <a:off x="0" y="0"/>
-                      <a:ext cx="3139712" cy="6675698"/>
+                      <a:ext cx="3817951" cy="6896698"/>
                     </a:xfrm>
                     <a:prstGeom prst="rect">
                       <a:avLst/>
@@ -40,14 +90,15 @@
           </wp:inline>
         </w:drawing>
       </w:r>
+      <w:r>
+        <w:t>Login Page</w:t>
+      </w:r>
     </w:p>
     <w:p>
       <w:r>
-        <w:br w:type="page"/>
-      </w:r>
-    </w:p>
-    <w:p>
-      <w:r>
+        <w:rPr>
+          <w:noProof/>
+        </w:rPr>
         <w:lastRenderedPageBreak/>
         <w:drawing>
           <wp:inline distT="0" distB="0" distL="0" distR="0" wp14:anchorId="704E566B" wp14:editId="085627E8">
@@ -65,7 +116,7 @@
                     <pic:cNvPicPr/>
                   </pic:nvPicPr>
                   <pic:blipFill>
-                    <a:blip r:embed="rId5"/>
+                    <a:blip r:embed="rId7"/>
                     <a:stretch>
                       <a:fillRect/>
                     </a:stretch>
@@ -85,6 +136,9 @@
           </wp:inline>
         </w:drawing>
       </w:r>
+      <w:r>
+        <w:t>Registration Page</w:t>
+      </w:r>
     </w:p>
     <w:p>
       <w:r>
@@ -95,10 +149,10 @@
       <w:r>
         <w:lastRenderedPageBreak/>
         <w:drawing>
-          <wp:inline distT="0" distB="0" distL="0" distR="0" wp14:anchorId="299BE59B" wp14:editId="5CC443A6">
-            <wp:extent cx="3139712" cy="6729043"/>
-            <wp:effectExtent l="0" t="0" r="3810" b="0"/>
-            <wp:docPr id="671905778" name="Picture 1"/>
+          <wp:inline distT="0" distB="0" distL="0" distR="0" wp14:anchorId="27C81865" wp14:editId="425C9908">
+            <wp:extent cx="3810330" cy="6782388"/>
+            <wp:effectExtent l="0" t="0" r="0" b="0"/>
+            <wp:docPr id="847337445" name="Picture 1"/>
             <wp:cNvGraphicFramePr>
               <a:graphicFrameLocks xmlns:a="http://schemas.openxmlformats.org/drawingml/2006/main" noChangeAspect="1"/>
             </wp:cNvGraphicFramePr>
@@ -106,11 +160,11 @@
               <a:graphicData uri="http://schemas.openxmlformats.org/drawingml/2006/picture">
                 <pic:pic xmlns:pic="http://schemas.openxmlformats.org/drawingml/2006/picture">
                   <pic:nvPicPr>
-                    <pic:cNvPr id="671905778" name=""/>
+                    <pic:cNvPr id="847337445" name=""/>
                     <pic:cNvPicPr/>
                   </pic:nvPicPr>
                   <pic:blipFill>
-                    <a:blip r:embed="rId6"/>
+                    <a:blip r:embed="rId8"/>
                     <a:stretch>
                       <a:fillRect/>
                     </a:stretch>
@@ -118,7 +172,7 @@
                   <pic:spPr>
                     <a:xfrm>
                       <a:off x="0" y="0"/>
-                      <a:ext cx="3139712" cy="6729043"/>
+                      <a:ext cx="3810330" cy="6782388"/>
                     </a:xfrm>
                     <a:prstGeom prst="rect">
                       <a:avLst/>
@@ -130,6 +184,9 @@
           </wp:inline>
         </w:drawing>
       </w:r>
+      <w:r>
+        <w:t>Home Page</w:t>
+      </w:r>
     </w:p>
     <w:p>
       <w:r>
@@ -140,10 +197,10 @@
       <w:r>
         <w:lastRenderedPageBreak/>
         <w:drawing>
-          <wp:inline distT="0" distB="0" distL="0" distR="0" wp14:anchorId="6301BF74" wp14:editId="551AAEA2">
-            <wp:extent cx="3398815" cy="6690940"/>
+          <wp:inline distT="0" distB="0" distL="0" distR="0" wp14:anchorId="60CAA238" wp14:editId="58BE1FF9">
+            <wp:extent cx="3909399" cy="6805250"/>
             <wp:effectExtent l="0" t="0" r="0" b="0"/>
-            <wp:docPr id="151453816" name="Picture 1"/>
+            <wp:docPr id="427869696" name="Picture 1"/>
             <wp:cNvGraphicFramePr>
               <a:graphicFrameLocks xmlns:a="http://schemas.openxmlformats.org/drawingml/2006/main" noChangeAspect="1"/>
             </wp:cNvGraphicFramePr>
@@ -151,11 +208,11 @@
               <a:graphicData uri="http://schemas.openxmlformats.org/drawingml/2006/picture">
                 <pic:pic xmlns:pic="http://schemas.openxmlformats.org/drawingml/2006/picture">
                   <pic:nvPicPr>
-                    <pic:cNvPr id="151453816" name=""/>
+                    <pic:cNvPr id="427869696" name=""/>
                     <pic:cNvPicPr/>
                   </pic:nvPicPr>
                   <pic:blipFill>
-                    <a:blip r:embed="rId7"/>
+                    <a:blip r:embed="rId9"/>
                     <a:stretch>
                       <a:fillRect/>
                     </a:stretch>
@@ -163,7 +220,7 @@
                   <pic:spPr>
                     <a:xfrm>
                       <a:off x="0" y="0"/>
-                      <a:ext cx="3398815" cy="6690940"/>
+                      <a:ext cx="3909399" cy="6805250"/>
                     </a:xfrm>
                     <a:prstGeom prst="rect">
                       <a:avLst/>
@@ -175,6 +232,9 @@
           </wp:inline>
         </w:drawing>
       </w:r>
+      <w:r>
+        <w:t>Creation Page</w:t>
+      </w:r>
     </w:p>
     <w:sectPr>
       <w:pgSz w:w="12240" w:h="15840"/>
@@ -184,6 +244,56 @@
     </w:sectPr>
   </w:body>
 </w:document>
+</file>
+
+<file path=word/endnotes.xml><?xml version="1.0" encoding="utf-8"?>
+<w:endnotes xmlns:wpc="http://schemas.microsoft.com/office/word/2010/wordprocessingCanvas" xmlns:cx="http://schemas.microsoft.com/office/drawing/2014/chartex" xmlns:cx1="http://schemas.microsoft.com/office/drawing/2015/9/8/chartex" xmlns:cx2="http://schemas.microsoft.com/office/drawing/2015/10/21/chartex" xmlns:cx3="http://schemas.microsoft.com/office/drawing/2016/5/9/chartex" xmlns:cx4="http://schemas.microsoft.com/office/drawing/2016/5/10/chartex" xmlns:cx5="http://schemas.microsoft.com/office/drawing/2016/5/11/chartex" xmlns:cx6="http://schemas.microsoft.com/office/drawing/2016/5/12/chartex" xmlns:cx7="http://schemas.microsoft.com/office/drawing/2016/5/13/chartex" xmlns:cx8="http://schemas.microsoft.com/office/drawing/2016/5/14/chartex" xmlns:mc="http://schemas.openxmlformats.org/markup-compatibility/2006" xmlns:aink="http://schemas.microsoft.com/office/drawing/2016/ink" xmlns:am3d="http://schemas.microsoft.com/office/drawing/2017/model3d" xmlns:o="urn:schemas-microsoft-com:office:office" xmlns:oel="http://schemas.microsoft.com/office/2019/extlst" xmlns:r="http://schemas.openxmlformats.org/officeDocument/2006/relationships" xmlns:m="http://schemas.openxmlformats.org/officeDocument/2006/math" xmlns:v="urn:schemas-microsoft-com:vml" xmlns:wp14="http://schemas.microsoft.com/office/word/2010/wordprocessingDrawing" xmlns:wp="http://schemas.openxmlformats.org/drawingml/2006/wordprocessingDrawing" xmlns:w10="urn:schemas-microsoft-com:office:word" xmlns:w="http://schemas.openxmlformats.org/wordprocessingml/2006/main" xmlns:w14="http://schemas.microsoft.com/office/word/2010/wordml" xmlns:w15="http://schemas.microsoft.com/office/word/2012/wordml" xmlns:w16cex="http://schemas.microsoft.com/office/word/2018/wordml/cex" xmlns:w16cid="http://schemas.microsoft.com/office/word/2016/wordml/cid" xmlns:w16="http://schemas.microsoft.com/office/word/2018/wordml" xmlns:w16du="http://schemas.microsoft.com/office/word/2023/wordml/word16du" xmlns:w16sdtdh="http://schemas.microsoft.com/office/word/2020/wordml/sdtdatahash" xmlns:w16sdtfl="http://schemas.microsoft.com/office/word/2024/wordml/sdtformatlock" xmlns:w16se="http://schemas.microsoft.com/office/word/2015/wordml/symex" xmlns:wpg="http://schemas.microsoft.com/office/word/2010/wordprocessingGroup" xmlns:wpi="http://schemas.microsoft.com/office/word/2010/wordprocessingInk" xmlns:wne="http://schemas.microsoft.com/office/word/2006/wordml" xmlns:wps="http://schemas.microsoft.com/office/word/2010/wordprocessingShape" mc:Ignorable="w14 w15 w16se w16cid w16 w16cex w16sdtdh w16sdtfl w16du wp14">
+  <w:endnote w:type="separator" w:id="-1">
+    <w:p>
+      <w:pPr>
+        <w:spacing w:after="0" w:line="240" w:lineRule="auto"/>
+      </w:pPr>
+      <w:r>
+        <w:separator/>
+      </w:r>
+    </w:p>
+  </w:endnote>
+  <w:endnote w:type="continuationSeparator" w:id="0">
+    <w:p>
+      <w:pPr>
+        <w:spacing w:after="0" w:line="240" w:lineRule="auto"/>
+      </w:pPr>
+      <w:r>
+        <w:continuationSeparator/>
+      </w:r>
+    </w:p>
+  </w:endnote>
+</w:endnotes>
+</file>
+
+<file path=word/footnotes.xml><?xml version="1.0" encoding="utf-8"?>
+<w:footnotes xmlns:wpc="http://schemas.microsoft.com/office/word/2010/wordprocessingCanvas" xmlns:cx="http://schemas.microsoft.com/office/drawing/2014/chartex" xmlns:cx1="http://schemas.microsoft.com/office/drawing/2015/9/8/chartex" xmlns:cx2="http://schemas.microsoft.com/office/drawing/2015/10/21/chartex" xmlns:cx3="http://schemas.microsoft.com/office/drawing/2016/5/9/chartex" xmlns:cx4="http://schemas.microsoft.com/office/drawing/2016/5/10/chartex" xmlns:cx5="http://schemas.microsoft.com/office/drawing/2016/5/11/chartex" xmlns:cx6="http://schemas.microsoft.com/office/drawing/2016/5/12/chartex" xmlns:cx7="http://schemas.microsoft.com/office/drawing/2016/5/13/chartex" xmlns:cx8="http://schemas.microsoft.com/office/drawing/2016/5/14/chartex" xmlns:mc="http://schemas.openxmlformats.org/markup-compatibility/2006" xmlns:aink="http://schemas.microsoft.com/office/drawing/2016/ink" xmlns:am3d="http://schemas.microsoft.com/office/drawing/2017/model3d" xmlns:o="urn:schemas-microsoft-com:office:office" xmlns:oel="http://schemas.microsoft.com/office/2019/extlst" xmlns:r="http://schemas.openxmlformats.org/officeDocument/2006/relationships" xmlns:m="http://schemas.openxmlformats.org/officeDocument/2006/math" xmlns:v="urn:schemas-microsoft-com:vml" xmlns:wp14="http://schemas.microsoft.com/office/word/2010/wordprocessingDrawing" xmlns:wp="http://schemas.openxmlformats.org/drawingml/2006/wordprocessingDrawing" xmlns:w10="urn:schemas-microsoft-com:office:word" xmlns:w="http://schemas.openxmlformats.org/wordprocessingml/2006/main" xmlns:w14="http://schemas.microsoft.com/office/word/2010/wordml" xmlns:w15="http://schemas.microsoft.com/office/word/2012/wordml" xmlns:w16cex="http://schemas.microsoft.com/office/word/2018/wordml/cex" xmlns:w16cid="http://schemas.microsoft.com/office/word/2016/wordml/cid" xmlns:w16="http://schemas.microsoft.com/office/word/2018/wordml" xmlns:w16du="http://schemas.microsoft.com/office/word/2023/wordml/word16du" xmlns:w16sdtdh="http://schemas.microsoft.com/office/word/2020/wordml/sdtdatahash" xmlns:w16sdtfl="http://schemas.microsoft.com/office/word/2024/wordml/sdtformatlock" xmlns:w16se="http://schemas.microsoft.com/office/word/2015/wordml/symex" xmlns:wpg="http://schemas.microsoft.com/office/word/2010/wordprocessingGroup" xmlns:wpi="http://schemas.microsoft.com/office/word/2010/wordprocessingInk" xmlns:wne="http://schemas.microsoft.com/office/word/2006/wordml" xmlns:wps="http://schemas.microsoft.com/office/word/2010/wordprocessingShape" mc:Ignorable="w14 w15 w16se w16cid w16 w16cex w16sdtdh w16sdtfl w16du wp14">
+  <w:footnote w:type="separator" w:id="-1">
+    <w:p>
+      <w:pPr>
+        <w:spacing w:after="0" w:line="240" w:lineRule="auto"/>
+      </w:pPr>
+      <w:r>
+        <w:separator/>
+      </w:r>
+    </w:p>
+  </w:footnote>
+  <w:footnote w:type="continuationSeparator" w:id="0">
+    <w:p>
+      <w:pPr>
+        <w:spacing w:after="0" w:line="240" w:lineRule="auto"/>
+      </w:pPr>
+      <w:r>
+        <w:continuationSeparator/>
+      </w:r>
+    </w:p>
+  </w:footnote>
+</w:footnotes>
 </file>
 
 <file path=word/styles.xml><?xml version="1.0" encoding="utf-8"?>
@@ -1103,6 +1213,73 @@
       <w:spacing w:val="5"/>
     </w:rPr>
   </w:style>
+  <w:style w:type="character" w:styleId="Hyperlink">
+    <w:name w:val="Hyperlink"/>
+    <w:basedOn w:val="DefaultParagraphFont"/>
+    <w:uiPriority w:val="99"/>
+    <w:unhideWhenUsed/>
+    <w:rsid w:val="00874FB5"/>
+    <w:rPr>
+      <w:color w:val="467886" w:themeColor="hyperlink"/>
+      <w:u w:val="single"/>
+    </w:rPr>
+  </w:style>
+  <w:style w:type="character" w:styleId="UnresolvedMention">
+    <w:name w:val="Unresolved Mention"/>
+    <w:basedOn w:val="DefaultParagraphFont"/>
+    <w:uiPriority w:val="99"/>
+    <w:semiHidden/>
+    <w:unhideWhenUsed/>
+    <w:rsid w:val="00874FB5"/>
+    <w:rPr>
+      <w:color w:val="605E5C"/>
+      <w:shd w:val="clear" w:color="auto" w:fill="E1DFDD"/>
+    </w:rPr>
+  </w:style>
+  <w:style w:type="paragraph" w:styleId="Header">
+    <w:name w:val="header"/>
+    <w:basedOn w:val="Normal"/>
+    <w:link w:val="HeaderChar"/>
+    <w:uiPriority w:val="99"/>
+    <w:unhideWhenUsed/>
+    <w:rsid w:val="00982119"/>
+    <w:pPr>
+      <w:tabs>
+        <w:tab w:val="center" w:pos="4680"/>
+        <w:tab w:val="right" w:pos="9360"/>
+      </w:tabs>
+      <w:spacing w:after="0" w:line="240" w:lineRule="auto"/>
+    </w:pPr>
+  </w:style>
+  <w:style w:type="character" w:customStyle="1" w:styleId="HeaderChar">
+    <w:name w:val="Header Char"/>
+    <w:basedOn w:val="DefaultParagraphFont"/>
+    <w:link w:val="Header"/>
+    <w:uiPriority w:val="99"/>
+    <w:rsid w:val="00982119"/>
+  </w:style>
+  <w:style w:type="paragraph" w:styleId="Footer">
+    <w:name w:val="footer"/>
+    <w:basedOn w:val="Normal"/>
+    <w:link w:val="FooterChar"/>
+    <w:uiPriority w:val="99"/>
+    <w:unhideWhenUsed/>
+    <w:rsid w:val="00982119"/>
+    <w:pPr>
+      <w:tabs>
+        <w:tab w:val="center" w:pos="4680"/>
+        <w:tab w:val="right" w:pos="9360"/>
+      </w:tabs>
+      <w:spacing w:after="0" w:line="240" w:lineRule="auto"/>
+    </w:pPr>
+  </w:style>
+  <w:style w:type="character" w:customStyle="1" w:styleId="FooterChar">
+    <w:name w:val="Footer Char"/>
+    <w:basedOn w:val="DefaultParagraphFont"/>
+    <w:link w:val="Footer"/>
+    <w:uiPriority w:val="99"/>
+    <w:rsid w:val="00982119"/>
+  </w:style>
 </w:styles>
 </file>
 

</xml_diff>